<commit_message>
Add S-band data: 3-band analysis (UHF + S + VHF)
Final S-band fetch yielded 797 SatNOGS observations across 9 of the 11
S-band CubeSat transmitters in the SatNOGS DB.  Joined dataset is now
3 431 rows: UHF 2 425, S 783, VHF 223.  X-band remains out of scope
because no public observations exist (see data/raw/sx_band_probe.json).

Three-band results:
  * H1 ANOVA p ≈ 0; mean SNR VHF 38.6 dB, UHF 34.6 dB, S 26.0 dB
    (Friis 1/λ² scaling visible — S is ~9 dB below UHF as expected)
  * H2 r = -0.421, p = 7.4e-148
  * H3 tropical vs polar t-test p = 6.8e-4
  * H4 r = +0.605, p ≈ 0
  * H5 OLS R² = 0.954 (improved from 0.932 with 2-band model)
  * external label sanity check: vetted-good vs vetted-bad t = 27.9,
    p ≈ 1e-144

Updates README, regenerates rapor.docx, all figures and tables.
</commit_message>
<xml_diff>
--- a/rapor.docx
+++ b/rapor.docx
@@ -509,7 +509,7 @@
           <w:b w:val="0"/>
           <w:sz w:val="22"/>
         </w:rPr>
-        <w:t>Birleştirilmiş veri seti 2648 gözlem içermektedir. Frekans bandı dağılımı: {'UHF': 2425, 'VHF': 223}. Yörünge yüksekliği aralığı: 345–888 km. Elevasyon aralığı: 5.0–90.0°. İstasyon enlem aralığı: -38.3°–63.9°.</w:t>
+        <w:t>Birleştirilmiş veri seti 3431 gözlem içermektedir. Frekans bandı dağılımı: {'UHF': 2425, 'S': 783, 'VHF': 223}. Yörünge yüksekliği aralığı: 345–888 km. Elevasyon aralığı: 2.0–90.0°. İstasyon enlem aralığı: -38.3°–63.9°.</w:t>
       </w:r>
     </w:p>
     <w:p>
@@ -647,6 +647,78 @@
                 <w:b/>
               </w:rPr>
               <w:t>max</w:t>
+            </w:r>
+          </w:p>
+        </w:tc>
+      </w:tr>
+      <w:tr>
+        <w:tc>
+          <w:tcPr>
+            <w:tcW w:type="dxa" w:w="1234"/>
+          </w:tcPr>
+          <w:p>
+            <w:r>
+              <w:t>S</w:t>
+            </w:r>
+          </w:p>
+        </w:tc>
+        <w:tc>
+          <w:tcPr>
+            <w:tcW w:type="dxa" w:w="1234"/>
+          </w:tcPr>
+          <w:p>
+            <w:r>
+              <w:t>783</w:t>
+            </w:r>
+          </w:p>
+        </w:tc>
+        <w:tc>
+          <w:tcPr>
+            <w:tcW w:type="dxa" w:w="1234"/>
+          </w:tcPr>
+          <w:p>
+            <w:r>
+              <w:t>26.0500</w:t>
+            </w:r>
+          </w:p>
+        </w:tc>
+        <w:tc>
+          <w:tcPr>
+            <w:tcW w:type="dxa" w:w="1234"/>
+          </w:tcPr>
+          <w:p>
+            <w:r>
+              <w:t>28.3700</w:t>
+            </w:r>
+          </w:p>
+        </w:tc>
+        <w:tc>
+          <w:tcPr>
+            <w:tcW w:type="dxa" w:w="1234"/>
+          </w:tcPr>
+          <w:p>
+            <w:r>
+              <w:t>4.5600</w:t>
+            </w:r>
+          </w:p>
+        </w:tc>
+        <w:tc>
+          <w:tcPr>
+            <w:tcW w:type="dxa" w:w="1234"/>
+          </w:tcPr>
+          <w:p>
+            <w:r>
+              <w:t>14.5100</w:t>
+            </w:r>
+          </w:p>
+        </w:tc>
+        <w:tc>
+          <w:tcPr>
+            <w:tcW w:type="dxa" w:w="1234"/>
+          </w:tcPr>
+          <w:p>
+            <w:r>
+              <w:t>30.9000</w:t>
             </w:r>
           </w:p>
         </w:tc>
@@ -803,7 +875,7 @@
       <w:r>
         <w:drawing>
           <wp:inline xmlns:a="http://schemas.openxmlformats.org/drawingml/2006/main" xmlns:pic="http://schemas.openxmlformats.org/drawingml/2006/picture">
-            <wp:extent cx="5220000" cy="3702452"/>
+            <wp:extent cx="5220000" cy="3805761"/>
             <wp:docPr id="1" name="Picture 1"/>
             <wp:cNvGraphicFramePr>
               <a:graphicFrameLocks noChangeAspect="1"/>
@@ -824,7 +896,7 @@
                   <pic:spPr>
                     <a:xfrm>
                       <a:off x="0" y="0"/>
-                      <a:ext cx="5220000" cy="3702452"/>
+                      <a:ext cx="5220000" cy="3805761"/>
                     </a:xfrm>
                     <a:prstGeom prst="rect"/>
                   </pic:spPr>
@@ -969,7 +1041,7 @@
           </w:tcPr>
           <w:p>
             <w:r>
-              <w:t>2648</w:t>
+              <w:t>3431</w:t>
             </w:r>
           </w:p>
         </w:tc>
@@ -979,7 +1051,7 @@
           </w:tcPr>
           <w:p>
             <w:r>
-              <w:t>-0.3544</w:t>
+              <w:t>-0.4215</w:t>
             </w:r>
           </w:p>
         </w:tc>
@@ -989,7 +1061,7 @@
           </w:tcPr>
           <w:p>
             <w:r>
-              <w:t>3.171e-79</w:t>
+              <w:t>7.347e-148</w:t>
             </w:r>
           </w:p>
         </w:tc>
@@ -999,7 +1071,7 @@
           </w:tcPr>
           <w:p>
             <w:r>
-              <w:t>-0.2450</w:t>
+              <w:t>-0.4869</w:t>
             </w:r>
           </w:p>
         </w:tc>
@@ -1009,7 +1081,7 @@
           </w:tcPr>
           <w:p>
             <w:r>
-              <w:t>1.697e-37</w:t>
+              <w:t>9.450e-204</w:t>
             </w:r>
           </w:p>
         </w:tc>
@@ -1031,7 +1103,7 @@
           </w:tcPr>
           <w:p>
             <w:r>
-              <w:t>2648</w:t>
+              <w:t>3431</w:t>
             </w:r>
           </w:p>
         </w:tc>
@@ -1041,7 +1113,7 @@
           </w:tcPr>
           <w:p>
             <w:r>
-              <w:t>0.7809</w:t>
+              <w:t>0.6045</w:t>
             </w:r>
           </w:p>
         </w:tc>
@@ -1061,7 +1133,7 @@
           </w:tcPr>
           <w:p>
             <w:r>
-              <w:t>0.7545</w:t>
+              <w:t>0.5597</w:t>
             </w:r>
           </w:p>
         </w:tc>
@@ -1071,7 +1143,7 @@
           </w:tcPr>
           <w:p>
             <w:r>
-              <w:t>0.000e+00</w:t>
+              <w:t>3.418e-282</w:t>
             </w:r>
           </w:p>
         </w:tc>
@@ -1093,7 +1165,7 @@
           </w:tcPr>
           <w:p>
             <w:r>
-              <w:t>2648</w:t>
+              <w:t>3431</w:t>
             </w:r>
           </w:p>
         </w:tc>
@@ -1103,7 +1175,7 @@
           </w:tcPr>
           <w:p>
             <w:r>
-              <w:t>-0.8444</w:t>
+              <w:t>-0.7620</w:t>
             </w:r>
           </w:p>
         </w:tc>
@@ -1123,7 +1195,7 @@
           </w:tcPr>
           <w:p>
             <w:r>
-              <w:t>-0.8638</w:t>
+              <w:t>-0.7807</w:t>
             </w:r>
           </w:p>
         </w:tc>
@@ -1155,7 +1227,7 @@
           </w:tcPr>
           <w:p>
             <w:r>
-              <w:t>2648</w:t>
+              <w:t>3431</w:t>
             </w:r>
           </w:p>
         </w:tc>
@@ -1165,7 +1237,7 @@
           </w:tcPr>
           <w:p>
             <w:r>
-              <w:t>-0.3139</w:t>
+              <w:t>-0.6919</w:t>
             </w:r>
           </w:p>
         </w:tc>
@@ -1175,7 +1247,7 @@
           </w:tcPr>
           <w:p>
             <w:r>
-              <w:t>1.220e-61</w:t>
+              <w:t>0.000e+00</w:t>
             </w:r>
           </w:p>
         </w:tc>
@@ -1185,7 +1257,7 @@
           </w:tcPr>
           <w:p>
             <w:r>
-              <w:t>-0.1751</w:t>
+              <w:t>-0.5640</w:t>
             </w:r>
           </w:p>
         </w:tc>
@@ -1195,7 +1267,7 @@
           </w:tcPr>
           <w:p>
             <w:r>
-              <w:t>1.097e-19</w:t>
+              <w:t>2.283e-287</w:t>
             </w:r>
           </w:p>
         </w:tc>
@@ -1217,7 +1289,7 @@
           </w:tcPr>
           <w:p>
             <w:r>
-              <w:t>2648</w:t>
+              <w:t>3431</w:t>
             </w:r>
           </w:p>
         </w:tc>
@@ -1227,7 +1299,7 @@
           </w:tcPr>
           <w:p>
             <w:r>
-              <w:t>-0.7594</w:t>
+              <w:t>-0.6338</w:t>
             </w:r>
           </w:p>
         </w:tc>
@@ -1247,7 +1319,7 @@
           </w:tcPr>
           <w:p>
             <w:r>
-              <w:t>-0.8062</w:t>
+              <w:t>-0.8318</w:t>
             </w:r>
           </w:p>
         </w:tc>
@@ -1279,7 +1351,7 @@
           </w:tcPr>
           <w:p>
             <w:r>
-              <w:t>2648</w:t>
+              <w:t>3431</w:t>
             </w:r>
           </w:p>
         </w:tc>
@@ -1289,7 +1361,7 @@
           </w:tcPr>
           <w:p>
             <w:r>
-              <w:t>-0.5652</w:t>
+              <w:t>-0.7041</w:t>
             </w:r>
           </w:p>
         </w:tc>
@@ -1299,7 +1371,7 @@
           </w:tcPr>
           <w:p>
             <w:r>
-              <w:t>2.128e-223</w:t>
+              <w:t>0.000e+00</w:t>
             </w:r>
           </w:p>
         </w:tc>
@@ -1309,7 +1381,7 @@
           </w:tcPr>
           <w:p>
             <w:r>
-              <w:t>-0.3997</w:t>
+              <w:t>-0.6965</w:t>
             </w:r>
           </w:p>
         </w:tc>
@@ -1319,7 +1391,7 @@
           </w:tcPr>
           <w:p>
             <w:r>
-              <w:t>3.961e-102</w:t>
+              <w:t>0.000e+00</w:t>
             </w:r>
           </w:p>
         </w:tc>
@@ -1441,7 +1513,7 @@
           </w:tcPr>
           <w:p>
             <w:r>
-              <w:t>233.1547</w:t>
+              <w:t>1634.4841</w:t>
             </w:r>
           </w:p>
         </w:tc>
@@ -1451,7 +1523,7 @@
           </w:tcPr>
           <w:p>
             <w:r>
-              <w:t>1.634e-50</w:t>
+              <w:t>0.000e+00</w:t>
             </w:r>
           </w:p>
         </w:tc>
@@ -1511,7 +1583,7 @@
           </w:tcPr>
           <w:p>
             <w:r>
-              <w:t>218.7737</w:t>
+              <w:t>1550.4813</w:t>
             </w:r>
           </w:p>
         </w:tc>
@@ -1521,7 +1593,7 @@
           </w:tcPr>
           <w:p>
             <w:r>
-              <w:t>1.674e-49</w:t>
+              <w:t>0.000e+00</w:t>
             </w:r>
           </w:p>
         </w:tc>
@@ -1651,6 +1723,150 @@
           </w:tcPr>
           <w:p>
             <w:r>
+              <w:t>S</w:t>
+            </w:r>
+          </w:p>
+        </w:tc>
+        <w:tc>
+          <w:tcPr>
+            <w:tcW w:type="dxa" w:w="1234"/>
+          </w:tcPr>
+          <w:p>
+            <w:r>
+              <w:t>UHF</w:t>
+            </w:r>
+          </w:p>
+        </w:tc>
+        <w:tc>
+          <w:tcPr>
+            <w:tcW w:type="dxa" w:w="1234"/>
+          </w:tcPr>
+          <w:p>
+            <w:r>
+              <w:t>783</w:t>
+            </w:r>
+          </w:p>
+        </w:tc>
+        <w:tc>
+          <w:tcPr>
+            <w:tcW w:type="dxa" w:w="1234"/>
+          </w:tcPr>
+          <w:p>
+            <w:r>
+              <w:t>2425</w:t>
+            </w:r>
+          </w:p>
+        </w:tc>
+        <w:tc>
+          <w:tcPr>
+            <w:tcW w:type="dxa" w:w="1234"/>
+          </w:tcPr>
+          <w:p>
+            <w:r>
+              <w:t>1.247e+05</w:t>
+            </w:r>
+          </w:p>
+        </w:tc>
+        <w:tc>
+          <w:tcPr>
+            <w:tcW w:type="dxa" w:w="1234"/>
+          </w:tcPr>
+          <w:p>
+            <w:r>
+              <w:t>2.733e-293</w:t>
+            </w:r>
+          </w:p>
+        </w:tc>
+        <w:tc>
+          <w:tcPr>
+            <w:tcW w:type="dxa" w:w="1234"/>
+          </w:tcPr>
+          <w:p>
+            <w:r>
+              <w:t>8.200e-293</w:t>
+            </w:r>
+          </w:p>
+        </w:tc>
+      </w:tr>
+      <w:tr>
+        <w:tc>
+          <w:tcPr>
+            <w:tcW w:type="dxa" w:w="1234"/>
+          </w:tcPr>
+          <w:p>
+            <w:r>
+              <w:t>S</w:t>
+            </w:r>
+          </w:p>
+        </w:tc>
+        <w:tc>
+          <w:tcPr>
+            <w:tcW w:type="dxa" w:w="1234"/>
+          </w:tcPr>
+          <w:p>
+            <w:r>
+              <w:t>VHF</w:t>
+            </w:r>
+          </w:p>
+        </w:tc>
+        <w:tc>
+          <w:tcPr>
+            <w:tcW w:type="dxa" w:w="1234"/>
+          </w:tcPr>
+          <w:p>
+            <w:r>
+              <w:t>783</w:t>
+            </w:r>
+          </w:p>
+        </w:tc>
+        <w:tc>
+          <w:tcPr>
+            <w:tcW w:type="dxa" w:w="1234"/>
+          </w:tcPr>
+          <w:p>
+            <w:r>
+              <w:t>223</w:t>
+            </w:r>
+          </w:p>
+        </w:tc>
+        <w:tc>
+          <w:tcPr>
+            <w:tcW w:type="dxa" w:w="1234"/>
+          </w:tcPr>
+          <w:p>
+            <w:r>
+              <w:t>28.0000</w:t>
+            </w:r>
+          </w:p>
+        </w:tc>
+        <w:tc>
+          <w:tcPr>
+            <w:tcW w:type="dxa" w:w="1234"/>
+          </w:tcPr>
+          <w:p>
+            <w:r>
+              <w:t>4.372e-115</w:t>
+            </w:r>
+          </w:p>
+        </w:tc>
+        <w:tc>
+          <w:tcPr>
+            <w:tcW w:type="dxa" w:w="1234"/>
+          </w:tcPr>
+          <w:p>
+            <w:r>
+              <w:t>1.312e-114</w:t>
+            </w:r>
+          </w:p>
+        </w:tc>
+      </w:tr>
+      <w:tr>
+        <w:tc>
+          <w:tcPr>
+            <w:tcW w:type="dxa" w:w="1234"/>
+          </w:tcPr>
+          <w:p>
+            <w:r>
               <w:t>UHF</w:t>
             </w:r>
           </w:p>
@@ -1711,7 +1927,7 @@
           </w:tcPr>
           <w:p>
             <w:r>
-              <w:t>1.676e-49</w:t>
+              <w:t>5.027e-49</w:t>
             </w:r>
           </w:p>
         </w:tc>
@@ -1876,7 +2092,7 @@
           </w:tcPr>
           <w:p>
             <w:r>
-              <w:t>-0.0122</w:t>
+              <w:t>-0.0219</w:t>
             </w:r>
           </w:p>
         </w:tc>
@@ -1886,7 +2102,7 @@
           </w:tcPr>
           <w:p>
             <w:r>
-              <w:t>41.4316</w:t>
+              <w:t>44.9044</w:t>
             </w:r>
           </w:p>
         </w:tc>
@@ -1896,7 +2112,7 @@
           </w:tcPr>
           <w:p>
             <w:r>
-              <w:t>-0.3544</w:t>
+              <w:t>-0.4215</w:t>
             </w:r>
           </w:p>
         </w:tc>
@@ -1906,7 +2122,7 @@
           </w:tcPr>
           <w:p>
             <w:r>
-              <w:t>0.1256</w:t>
+              <w:t>0.1777</w:t>
             </w:r>
           </w:p>
         </w:tc>
@@ -1916,7 +2132,7 @@
           </w:tcPr>
           <w:p>
             <w:r>
-              <w:t>3.171e-79</w:t>
+              <w:t>7.347e-148</w:t>
             </w:r>
           </w:p>
         </w:tc>
@@ -1926,7 +2142,7 @@
           </w:tcPr>
           <w:p>
             <w:r>
-              <w:t>6.279e-04</w:t>
+              <w:t>8.048e-04</w:t>
             </w:r>
           </w:p>
         </w:tc>
@@ -1936,7 +2152,7 @@
           </w:tcPr>
           <w:p>
             <w:r>
-              <w:t>2648</w:t>
+              <w:t>3431</w:t>
             </w:r>
           </w:p>
         </w:tc>
@@ -1958,7 +2174,7 @@
           </w:tcPr>
           <w:p>
             <w:r>
-              <w:t>0.1265</w:t>
+              <w:t>0.1332</w:t>
             </w:r>
           </w:p>
         </w:tc>
@@ -1968,7 +2184,7 @@
           </w:tcPr>
           <w:p>
             <w:r>
-              <w:t>28.7297</w:t>
+              <w:t>26.3671</w:t>
             </w:r>
           </w:p>
         </w:tc>
@@ -1978,7 +2194,7 @@
           </w:tcPr>
           <w:p>
             <w:r>
-              <w:t>0.7809</w:t>
+              <w:t>0.6045</w:t>
             </w:r>
           </w:p>
         </w:tc>
@@ -1988,7 +2204,7 @@
           </w:tcPr>
           <w:p>
             <w:r>
-              <w:t>0.6098</w:t>
+              <w:t>0.3654</w:t>
             </w:r>
           </w:p>
         </w:tc>
@@ -2008,7 +2224,7 @@
           </w:tcPr>
           <w:p>
             <w:r>
-              <w:t>0.0020</w:t>
+              <w:t>0.0030</w:t>
             </w:r>
           </w:p>
         </w:tc>
@@ -2018,7 +2234,7 @@
           </w:tcPr>
           <w:p>
             <w:r>
-              <w:t>2648</w:t>
+              <w:t>3431</w:t>
             </w:r>
           </w:p>
         </w:tc>
@@ -2040,7 +2256,7 @@
           </w:tcPr>
           <w:p>
             <w:r>
-              <w:t>-0.0075</w:t>
+              <w:t>-0.0085</w:t>
             </w:r>
           </w:p>
         </w:tc>
@@ -2050,7 +2266,7 @@
           </w:tcPr>
           <w:p>
             <w:r>
-              <w:t>41.2988</w:t>
+              <w:t>40.5298</w:t>
             </w:r>
           </w:p>
         </w:tc>
@@ -2060,7 +2276,7 @@
           </w:tcPr>
           <w:p>
             <w:r>
-              <w:t>-0.8444</w:t>
+              <w:t>-0.7620</w:t>
             </w:r>
           </w:p>
         </w:tc>
@@ -2070,7 +2286,7 @@
           </w:tcPr>
           <w:p>
             <w:r>
-              <w:t>0.7130</w:t>
+              <w:t>0.5807</w:t>
             </w:r>
           </w:p>
         </w:tc>
@@ -2090,7 +2306,7 @@
           </w:tcPr>
           <w:p>
             <w:r>
-              <w:t>9.281e-05</w:t>
+              <w:t>1.240e-04</w:t>
             </w:r>
           </w:p>
         </w:tc>
@@ -2100,7 +2316,7 @@
           </w:tcPr>
           <w:p>
             <w:r>
-              <w:t>2648</w:t>
+              <w:t>3431</w:t>
             </w:r>
           </w:p>
         </w:tc>
@@ -2113,7 +2329,7 @@
       <w:r>
         <w:drawing>
           <wp:inline xmlns:a="http://schemas.openxmlformats.org/drawingml/2006/main" xmlns:pic="http://schemas.openxmlformats.org/drawingml/2006/picture">
-            <wp:extent cx="5220000" cy="3702452"/>
+            <wp:extent cx="5220000" cy="3805761"/>
             <wp:docPr id="3" name="Picture 3"/>
             <wp:cNvGraphicFramePr>
               <a:graphicFrameLocks noChangeAspect="1"/>
@@ -2134,7 +2350,7 @@
                   <pic:spPr>
                     <a:xfrm>
                       <a:off x="0" y="0"/>
-                      <a:ext cx="5220000" cy="3702452"/>
+                      <a:ext cx="5220000" cy="3805761"/>
                     </a:xfrm>
                     <a:prstGeom prst="rect"/>
                   </pic:spPr>
@@ -2164,7 +2380,7 @@
       <w:r>
         <w:drawing>
           <wp:inline xmlns:a="http://schemas.openxmlformats.org/drawingml/2006/main" xmlns:pic="http://schemas.openxmlformats.org/drawingml/2006/picture">
-            <wp:extent cx="5220000" cy="3686312"/>
+            <wp:extent cx="5220000" cy="3788710"/>
             <wp:docPr id="4" name="Picture 4"/>
             <wp:cNvGraphicFramePr>
               <a:graphicFrameLocks noChangeAspect="1"/>
@@ -2185,7 +2401,7 @@
                   <pic:spPr>
                     <a:xfrm>
                       <a:off x="0" y="0"/>
-                      <a:ext cx="5220000" cy="3686312"/>
+                      <a:ext cx="5220000" cy="3788710"/>
                     </a:xfrm>
                     <a:prstGeom prst="rect"/>
                   </pic:spPr>
@@ -2215,7 +2431,7 @@
       <w:r>
         <w:drawing>
           <wp:inline xmlns:a="http://schemas.openxmlformats.org/drawingml/2006/main" xmlns:pic="http://schemas.openxmlformats.org/drawingml/2006/picture">
-            <wp:extent cx="5220000" cy="3676696"/>
+            <wp:extent cx="5220000" cy="3805761"/>
             <wp:docPr id="5" name="Picture 5"/>
             <wp:cNvGraphicFramePr>
               <a:graphicFrameLocks noChangeAspect="1"/>
@@ -2236,7 +2452,7 @@
                   <pic:spPr>
                     <a:xfrm>
                       <a:off x="0" y="0"/>
-                      <a:ext cx="5220000" cy="3676696"/>
+                      <a:ext cx="5220000" cy="3805761"/>
                     </a:xfrm>
                     <a:prstGeom prst="rect"/>
                   </pic:spPr>
@@ -2366,7 +2582,7 @@
           </w:tcPr>
           <w:p>
             <w:r>
-              <w:t>2648.0000</w:t>
+              <w:t>3431.0000</w:t>
             </w:r>
           </w:p>
         </w:tc>
@@ -2376,7 +2592,7 @@
           </w:tcPr>
           <w:p>
             <w:r>
-              <w:t>0.9324</w:t>
+              <w:t>0.9543</w:t>
             </w:r>
           </w:p>
         </w:tc>
@@ -2386,7 +2602,7 @@
           </w:tcPr>
           <w:p>
             <w:r>
-              <w:t>0.9323</w:t>
+              <w:t>0.9543</w:t>
             </w:r>
           </w:p>
         </w:tc>
@@ -2396,7 +2612,7 @@
           </w:tcPr>
           <w:p>
             <w:r>
-              <w:t>9119.0893</w:t>
+              <w:t>1.431e+04</w:t>
             </w:r>
           </w:p>
         </w:tc>
@@ -2518,7 +2734,7 @@
           </w:tcPr>
           <w:p>
             <w:r>
-              <w:t>40.9761</w:t>
+              <w:t>42.0311</w:t>
             </w:r>
           </w:p>
         </w:tc>
@@ -2528,7 +2744,7 @@
           </w:tcPr>
           <w:p>
             <w:r>
-              <w:t>0.4718</w:t>
+              <w:t>1.5149</w:t>
             </w:r>
           </w:p>
         </w:tc>
@@ -2538,7 +2754,7 @@
           </w:tcPr>
           <w:p>
             <w:r>
-              <w:t>86.8554</w:t>
+              <w:t>27.7458</w:t>
             </w:r>
           </w:p>
         </w:tc>
@@ -2548,7 +2764,7 @@
           </w:tcPr>
           <w:p>
             <w:r>
-              <w:t>0.000e+00</w:t>
+              <w:t>5.132e-153</w:t>
             </w:r>
           </w:p>
         </w:tc>
@@ -2570,7 +2786,7 @@
           </w:tcPr>
           <w:p>
             <w:r>
-              <w:t>-0.0156</w:t>
+              <w:t>-0.0160</w:t>
             </w:r>
           </w:p>
         </w:tc>
@@ -2580,7 +2796,7 @@
           </w:tcPr>
           <w:p>
             <w:r>
-              <w:t>1.878e-04</w:t>
+              <w:t>2.085e-04</w:t>
             </w:r>
           </w:p>
         </w:tc>
@@ -2590,7 +2806,7 @@
           </w:tcPr>
           <w:p>
             <w:r>
-              <w:t>-82.9239</w:t>
+              <w:t>-76.8252</w:t>
             </w:r>
           </w:p>
         </w:tc>
@@ -2622,7 +2838,7 @@
           </w:tcPr>
           <w:p>
             <w:r>
-              <w:t>0.1301</w:t>
+              <w:t>0.1361</w:t>
             </w:r>
           </w:p>
         </w:tc>
@@ -2632,7 +2848,7 @@
           </w:tcPr>
           <w:p>
             <w:r>
-              <w:t>8.223e-04</w:t>
+              <w:t>8.084e-04</w:t>
             </w:r>
           </w:p>
         </w:tc>
@@ -2642,7 +2858,7 @@
           </w:tcPr>
           <w:p>
             <w:r>
-              <w:t>158.1944</w:t>
+              <w:t>168.3936</w:t>
             </w:r>
           </w:p>
         </w:tc>
@@ -2674,7 +2890,7 @@
           </w:tcPr>
           <w:p>
             <w:r>
-              <w:t>-11.1497</w:t>
+              <w:t>-5.7588</w:t>
             </w:r>
           </w:p>
         </w:tc>
@@ -2684,7 +2900,7 @@
           </w:tcPr>
           <w:p>
             <w:r>
-              <w:t>1.1315</w:t>
+              <w:t>0.6726</w:t>
             </w:r>
           </w:p>
         </w:tc>
@@ -2694,7 +2910,7 @@
           </w:tcPr>
           <w:p>
             <w:r>
-              <w:t>-9.8536</w:t>
+              <w:t>-8.5619</w:t>
             </w:r>
           </w:p>
         </w:tc>
@@ -2704,7 +2920,59 @@
           </w:tcPr>
           <w:p>
             <w:r>
-              <w:t>1.607e-22</w:t>
+              <w:t>1.651e-17</w:t>
+            </w:r>
+          </w:p>
+        </w:tc>
+      </w:tr>
+      <w:tr>
+        <w:tc>
+          <w:tcPr>
+            <w:tcW w:type="dxa" w:w="1728"/>
+          </w:tcPr>
+          <w:p>
+            <w:r>
+              <w:t>band_UHF</w:t>
+            </w:r>
+          </w:p>
+        </w:tc>
+        <w:tc>
+          <w:tcPr>
+            <w:tcW w:type="dxa" w:w="1728"/>
+          </w:tcPr>
+          <w:p>
+            <w:r>
+              <w:t>-3.4188</w:t>
+            </w:r>
+          </w:p>
+        </w:tc>
+        <w:tc>
+          <w:tcPr>
+            <w:tcW w:type="dxa" w:w="1728"/>
+          </w:tcPr>
+          <w:p>
+            <w:r>
+              <w:t>1.2276</w:t>
+            </w:r>
+          </w:p>
+        </w:tc>
+        <w:tc>
+          <w:tcPr>
+            <w:tcW w:type="dxa" w:w="1728"/>
+          </w:tcPr>
+          <w:p>
+            <w:r>
+              <w:t>-2.7850</w:t>
+            </w:r>
+          </w:p>
+        </w:tc>
+        <w:tc>
+          <w:tcPr>
+            <w:tcW w:type="dxa" w:w="1728"/>
+          </w:tcPr>
+          <w:p>
+            <w:r>
+              <w:t>0.0054</w:t>
             </w:r>
           </w:p>
         </w:tc>
@@ -2726,7 +2994,7 @@
           </w:tcPr>
           <w:p>
             <w:r>
-              <w:t>3.6459</w:t>
+              <w:t>1.8586</w:t>
             </w:r>
           </w:p>
         </w:tc>
@@ -2736,7 +3004,7 @@
           </w:tcPr>
           <w:p>
             <w:r>
-              <w:t>0.3356</w:t>
+              <w:t>1.4228</w:t>
             </w:r>
           </w:p>
         </w:tc>
@@ -2746,7 +3014,7 @@
           </w:tcPr>
           <w:p>
             <w:r>
-              <w:t>10.8628</w:t>
+              <w:t>1.3063</w:t>
             </w:r>
           </w:p>
         </w:tc>
@@ -2756,7 +3024,7 @@
           </w:tcPr>
           <w:p>
             <w:r>
-              <w:t>6.364e-27</w:t>
+              <w:t>0.1915</w:t>
             </w:r>
           </w:p>
         </w:tc>
@@ -2870,7 +3138,7 @@
           </w:tcPr>
           <w:p>
             <w:r>
-              <w:t>336</w:t>
+              <w:t>337</w:t>
             </w:r>
           </w:p>
         </w:tc>
@@ -2880,7 +3148,7 @@
           </w:tcPr>
           <w:p>
             <w:r>
-              <w:t>1379</w:t>
+              <w:t>2065</w:t>
             </w:r>
           </w:p>
         </w:tc>
@@ -2890,7 +3158,7 @@
           </w:tcPr>
           <w:p>
             <w:r>
-              <w:t>-7.0583</w:t>
+              <w:t>3.4185</w:t>
             </w:r>
           </w:p>
         </w:tc>
@@ -2900,7 +3168,7 @@
           </w:tcPr>
           <w:p>
             <w:r>
-              <w:t>6.932e-12</w:t>
+              <w:t>6.800e-04</w:t>
             </w:r>
           </w:p>
         </w:tc>
@@ -2912,7 +3180,7 @@
           </w:tcPr>
           <w:p>
             <w:r>
-              <w:t>elevation&gt;=49.0° vs &lt;49.0°</w:t>
+              <w:t>elevation&gt;=51.0° vs &lt;51.0°</w:t>
             </w:r>
           </w:p>
         </w:tc>
@@ -2922,7 +3190,7 @@
           </w:tcPr>
           <w:p>
             <w:r>
-              <w:t>1371</w:t>
+              <w:t>1733</w:t>
             </w:r>
           </w:p>
         </w:tc>
@@ -2932,7 +3200,7 @@
           </w:tcPr>
           <w:p>
             <w:r>
-              <w:t>1277</w:t>
+              <w:t>1698</w:t>
             </w:r>
           </w:p>
         </w:tc>
@@ -2942,7 +3210,7 @@
           </w:tcPr>
           <w:p>
             <w:r>
-              <w:t>48.0441</w:t>
+              <w:t>32.4130</w:t>
             </w:r>
           </w:p>
         </w:tc>
@@ -2952,7 +3220,7 @@
           </w:tcPr>
           <w:p>
             <w:r>
-              <w:t>0.000e+00</w:t>
+              <w:t>6.475e-198</w:t>
             </w:r>
           </w:p>
         </w:tc>
@@ -2974,7 +3242,7 @@
           </w:tcPr>
           <w:p>
             <w:r>
-              <w:t>1948</w:t>
+              <w:t>2089</w:t>
             </w:r>
           </w:p>
         </w:tc>
@@ -2984,7 +3252,7 @@
           </w:tcPr>
           <w:p>
             <w:r>
-              <w:t>700</w:t>
+              <w:t>1342</w:t>
             </w:r>
           </w:p>
         </w:tc>
@@ -2994,7 +3262,7 @@
           </w:tcPr>
           <w:p>
             <w:r>
-              <w:t>9.8295</w:t>
+              <w:t>27.9314</w:t>
             </w:r>
           </w:p>
         </w:tc>
@@ -3004,7 +3272,7 @@
           </w:tcPr>
           <w:p>
             <w:r>
-              <w:t>9.447e-22</w:t>
+              <w:t>1.031e-144</w:t>
             </w:r>
           </w:p>
         </w:tc>
@@ -3017,7 +3285,7 @@
       <w:r>
         <w:drawing>
           <wp:inline xmlns:a="http://schemas.openxmlformats.org/drawingml/2006/main" xmlns:pic="http://schemas.openxmlformats.org/drawingml/2006/picture">
-            <wp:extent cx="5220000" cy="3638726"/>
+            <wp:extent cx="5220000" cy="3771811"/>
             <wp:docPr id="6" name="Picture 6"/>
             <wp:cNvGraphicFramePr>
               <a:graphicFrameLocks noChangeAspect="1"/>
@@ -3038,7 +3306,7 @@
                   <pic:spPr>
                     <a:xfrm>
                       <a:off x="0" y="0"/>
-                      <a:ext cx="5220000" cy="3638726"/>
+                      <a:ext cx="5220000" cy="3771811"/>
                     </a:xfrm>
                     <a:prstGeom prst="rect"/>
                   </pic:spPr>
@@ -3148,6 +3416,58 @@
                 <w:b/>
               </w:rPr>
               <w:t>ci_high</w:t>
+            </w:r>
+          </w:p>
+        </w:tc>
+      </w:tr>
+      <w:tr>
+        <w:tc>
+          <w:tcPr>
+            <w:tcW w:type="dxa" w:w="1728"/>
+          </w:tcPr>
+          <w:p>
+            <w:r>
+              <w:t>S</w:t>
+            </w:r>
+          </w:p>
+        </w:tc>
+        <w:tc>
+          <w:tcPr>
+            <w:tcW w:type="dxa" w:w="1728"/>
+          </w:tcPr>
+          <w:p>
+            <w:r>
+              <w:t>783</w:t>
+            </w:r>
+          </w:p>
+        </w:tc>
+        <w:tc>
+          <w:tcPr>
+            <w:tcW w:type="dxa" w:w="1728"/>
+          </w:tcPr>
+          <w:p>
+            <w:r>
+              <w:t>26.0480</w:t>
+            </w:r>
+          </w:p>
+        </w:tc>
+        <w:tc>
+          <w:tcPr>
+            <w:tcW w:type="dxa" w:w="1728"/>
+          </w:tcPr>
+          <w:p>
+            <w:r>
+              <w:t>25.7280</w:t>
+            </w:r>
+          </w:p>
+        </w:tc>
+        <w:tc>
+          <w:tcPr>
+            <w:tcW w:type="dxa" w:w="1728"/>
+          </w:tcPr>
+          <w:p>
+            <w:r>
+              <w:t>26.3680</w:t>
             </w:r>
           </w:p>
         </w:tc>
@@ -3347,7 +3667,7 @@
           </w:tcPr>
           <w:p>
             <w:r>
-              <w:t>F-test p=1.63e-50</w:t>
+              <w:t>F-test p=0</w:t>
             </w:r>
           </w:p>
         </w:tc>
@@ -3379,7 +3699,7 @@
           </w:tcPr>
           <w:p>
             <w:r>
-              <w:t>r=-0.354, p=3.17e-79</w:t>
+              <w:t>r=-0.421, p=7.35e-148</w:t>
             </w:r>
           </w:p>
         </w:tc>
@@ -3411,7 +3731,7 @@
           </w:tcPr>
           <w:p>
             <w:r>
-              <w:t>t-test p=6.93e-12</w:t>
+              <w:t>t-test p=0.00068</w:t>
             </w:r>
           </w:p>
         </w:tc>
@@ -3443,7 +3763,7 @@
           </w:tcPr>
           <w:p>
             <w:r>
-              <w:t>r=0.781, p=0</w:t>
+              <w:t>r=0.605, p=0</w:t>
             </w:r>
           </w:p>
         </w:tc>
@@ -3475,7 +3795,7 @@
           </w:tcPr>
           <w:p>
             <w:r>
-              <w:t>R²=0.932, F-p=0</w:t>
+              <w:t>R²=0.954, F-p=0</w:t>
             </w:r>
           </w:p>
         </w:tc>

</xml_diff>